<commit_message>
docs: add evidence and evaluation criteria
</commit_message>
<xml_diff>
--- a/versions/v2.6-manuals/模型制造与装配手册.docx
+++ b/versions/v2.6-manuals/模型制造与装配手册.docx
@@ -9121,6 +9121,2126 @@
     <w:p>
       <w:r>
         <w:t>文献实测、本项目几何计算和待验证建议须分开使用。32°分层概念有直接试验依据；1000 mm长度、120 mm主动层、A0至A20、B30和全部制造偏差目标属于本项目建议。不存在已确认的通用最佳土配方或无需小试即可保证失稳的固定加水量。</w:t>
+      </w:r>
+    </w:p>
+    <w:p>
+      <w:pPr>
+        <w:pStyle w:val="Heading1"/>
+      </w:pPr>
+      <w:r>
+        <w:t>16 论文规范到制造动作的依据矩阵</w:t>
+      </w:r>
+    </w:p>
+    <w:p>
+      <w:r>
+        <w:t>本项目的实现依据分为三层。第一层是论文中已经观察到的物理现象和试验做法，用来决定模型应具备什么机制；第二层是土工试验和工程监测规范，用来规定材料和测量的记录方法；第三层是本项目为小型室内试验提出的尺寸、偏差和放行建议，必须通过首轮小试后冻结。三层不能互相替代。</w:t>
+      </w:r>
+    </w:p>
+    <w:tbl>
+      <w:tblPr>
+        <w:tblW w:type="auto" w:w="0"/>
+        <w:jc w:val="center"/>
+        <w:tblLayout w:type="fixed"/>
+        <w:tblLook w:firstColumn="1" w:firstRow="1" w:lastColumn="0" w:lastRow="0" w:noHBand="0" w:noVBand="1" w:val="04A0"/>
+        <w:tblBorders>
+          <w:top w:val="single" w:sz="4" w:color="D9D9D9"/>
+          <w:left w:val="single" w:sz="4" w:color="D9D9D9"/>
+          <w:bottom w:val="single" w:sz="4" w:color="D9D9D9"/>
+          <w:right w:val="single" w:sz="4" w:color="D9D9D9"/>
+          <w:insideH w:val="single" w:sz="4" w:color="D9D9D9"/>
+          <w:insideV w:val="single" w:sz="4" w:color="D9D9D9"/>
+        </w:tblBorders>
+      </w:tblPr>
+      <w:tblGrid>
+        <w:gridCol w:w="1788"/>
+        <w:gridCol w:w="2583"/>
+        <w:gridCol w:w="2186"/>
+        <w:gridCol w:w="3378"/>
+      </w:tblGrid>
+      <w:tr>
+        <w:trPr>
+          <w:tblHeader/>
+          <w:cantSplit/>
+        </w:trPr>
+        <w:tc>
+          <w:tcPr>
+            <w:tcW w:type="dxa" w:w="1788"/>
+            <w:vAlign w:val="center"/>
+            <w:tcMar>
+              <w:top w:w="75" w:type="dxa"/>
+              <w:left w:w="75" w:type="dxa"/>
+              <w:bottom w:w="75" w:type="dxa"/>
+              <w:right w:w="75" w:type="dxa"/>
+            </w:tcMar>
+            <w:shd w:fill="DCE8EE"/>
+          </w:tcPr>
+          <w:p>
+            <w:pPr>
+              <w:keepNext/>
+              <w:spacing w:after="20" w:before="20" w:line="269" w:lineRule="auto"/>
+              <w:jc w:val="center"/>
+            </w:pPr>
+            <w:r>
+              <w:rPr>
+                <w:b/>
+                <w:sz w:val="20"/>
+              </w:rPr>
+              <w:t>依据</w:t>
+            </w:r>
+          </w:p>
+        </w:tc>
+        <w:tc>
+          <w:tcPr>
+            <w:tcW w:type="dxa" w:w="2583"/>
+            <w:vAlign w:val="center"/>
+            <w:tcMar>
+              <w:top w:w="75" w:type="dxa"/>
+              <w:left w:w="75" w:type="dxa"/>
+              <w:bottom w:w="75" w:type="dxa"/>
+              <w:right w:w="75" w:type="dxa"/>
+            </w:tcMar>
+            <w:shd w:fill="DCE8EE"/>
+          </w:tcPr>
+          <w:p>
+            <w:pPr>
+              <w:keepNext/>
+              <w:spacing w:after="20" w:before="20" w:line="269" w:lineRule="auto"/>
+              <w:jc w:val="center"/>
+            </w:pPr>
+            <w:r>
+              <w:rPr>
+                <w:b/>
+                <w:sz w:val="20"/>
+              </w:rPr>
+              <w:t>文献或标准直接支持的内容</w:t>
+            </w:r>
+          </w:p>
+        </w:tc>
+        <w:tc>
+          <w:tcPr>
+            <w:tcW w:type="dxa" w:w="2186"/>
+            <w:vAlign w:val="center"/>
+            <w:tcMar>
+              <w:top w:w="75" w:type="dxa"/>
+              <w:left w:w="75" w:type="dxa"/>
+              <w:bottom w:w="75" w:type="dxa"/>
+              <w:right w:w="75" w:type="dxa"/>
+            </w:tcMar>
+            <w:shd w:fill="DCE8EE"/>
+          </w:tcPr>
+          <w:p>
+            <w:pPr>
+              <w:keepNext/>
+              <w:spacing w:after="20" w:before="20" w:line="269" w:lineRule="auto"/>
+              <w:jc w:val="center"/>
+            </w:pPr>
+            <w:r>
+              <w:rPr>
+                <w:b/>
+                <w:sz w:val="20"/>
+              </w:rPr>
+              <w:t>在本模型中的实现动作</w:t>
+            </w:r>
+          </w:p>
+        </w:tc>
+        <w:tc>
+          <w:tcPr>
+            <w:tcW w:type="dxa" w:w="3378"/>
+            <w:vAlign w:val="center"/>
+            <w:tcMar>
+              <w:top w:w="75" w:type="dxa"/>
+              <w:left w:w="75" w:type="dxa"/>
+              <w:bottom w:w="75" w:type="dxa"/>
+              <w:right w:w="75" w:type="dxa"/>
+            </w:tcMar>
+            <w:shd w:fill="DCE8EE"/>
+          </w:tcPr>
+          <w:p>
+            <w:pPr>
+              <w:keepNext/>
+              <w:spacing w:after="20" w:before="20" w:line="269" w:lineRule="auto"/>
+              <w:jc w:val="center"/>
+            </w:pPr>
+            <w:r>
+              <w:rPr>
+                <w:b/>
+                <w:sz w:val="20"/>
+              </w:rPr>
+              <w:t>不能直接推出的结论</w:t>
+            </w:r>
+          </w:p>
+        </w:tc>
+      </w:tr>
+      <w:tr>
+        <w:trPr>
+          <w:cantSplit/>
+        </w:trPr>
+        <w:tc>
+          <w:tcPr>
+            <w:tcW w:type="dxa" w:w="1788"/>
+            <w:vAlign w:val="center"/>
+            <w:tcMar>
+              <w:top w:w="75" w:type="dxa"/>
+              <w:left w:w="75" w:type="dxa"/>
+              <w:bottom w:w="75" w:type="dxa"/>
+              <w:right w:w="75" w:type="dxa"/>
+            </w:tcMar>
+            <w:shd w:fill="FFFFFF"/>
+          </w:tcPr>
+          <w:p>
+            <w:pPr>
+              <w:spacing w:after="20" w:before="20" w:line="269" w:lineRule="auto"/>
+            </w:pPr>
+            <w:r>
+              <w:rPr>
+                <w:b w:val="0"/>
+                <w:sz w:val="20"/>
+              </w:rPr>
+              <w:t>Schenato等，2017，Scientific Reports，DOI 10.1038/s41598-017-12610-1</w:t>
+            </w:r>
+          </w:p>
+        </w:tc>
+        <w:tc>
+          <w:tcPr>
+            <w:tcW w:type="dxa" w:w="2583"/>
+            <w:vAlign w:val="center"/>
+            <w:tcMar>
+              <w:top w:w="75" w:type="dxa"/>
+              <w:left w:w="75" w:type="dxa"/>
+              <w:bottom w:w="75" w:type="dxa"/>
+              <w:right w:w="75" w:type="dxa"/>
+            </w:tcMar>
+            <w:shd w:fill="FFFFFF"/>
+          </w:tcPr>
+          <w:p>
+            <w:pPr>
+              <w:spacing w:after="20" w:before="20" w:line="269" w:lineRule="auto"/>
+            </w:pPr>
+            <w:r>
+              <w:rPr>
+                <w:b w:val="0"/>
+                <w:sz w:val="20"/>
+              </w:rPr>
+              <w:t>分层松砂坡、低渗床、降雨诱发浅层变形以及光纤与土体耦合干扰</w:t>
+            </w:r>
+          </w:p>
+        </w:tc>
+        <w:tc>
+          <w:tcPr>
+            <w:tcW w:type="dxa" w:w="2186"/>
+            <w:vAlign w:val="center"/>
+            <w:tcMar>
+              <w:top w:w="75" w:type="dxa"/>
+              <w:left w:w="75" w:type="dxa"/>
+              <w:bottom w:w="75" w:type="dxa"/>
+              <w:right w:w="75" w:type="dxa"/>
+            </w:tcMar>
+            <w:shd w:fill="FFFFFF"/>
+          </w:tcPr>
+          <w:p>
+            <w:pPr>
+              <w:spacing w:after="20" w:before="20" w:line="269" w:lineRule="auto"/>
+            </w:pPr>
+            <w:r>
+              <w:rPr>
+                <w:b w:val="0"/>
+                <w:sz w:val="20"/>
+              </w:rPr>
+              <w:t>设置40 mm低渗床、120 mm主动层；铺土、喷淋、光纤、视频和水力同步记录</w:t>
+            </w:r>
+          </w:p>
+        </w:tc>
+        <w:tc>
+          <w:tcPr>
+            <w:tcW w:type="dxa" w:w="3378"/>
+            <w:vAlign w:val="center"/>
+            <w:tcMar>
+              <w:top w:w="75" w:type="dxa"/>
+              <w:left w:w="75" w:type="dxa"/>
+              <w:bottom w:w="75" w:type="dxa"/>
+              <w:right w:w="75" w:type="dxa"/>
+            </w:tcMar>
+            <w:shd w:fill="FFFFFF"/>
+          </w:tcPr>
+          <w:p>
+            <w:pPr>
+              <w:spacing w:after="20" w:before="20" w:line="269" w:lineRule="auto"/>
+            </w:pPr>
+            <w:r>
+              <w:rPr>
+                <w:b w:val="0"/>
+                <w:sz w:val="20"/>
+              </w:rPr>
+              <w:t>不能把约5 m原型、160 mm/h雨强或分布式光纤参数缩小后直接照搬</w:t>
+            </w:r>
+          </w:p>
+        </w:tc>
+      </w:tr>
+      <w:tr>
+        <w:trPr>
+          <w:cantSplit/>
+        </w:trPr>
+        <w:tc>
+          <w:tcPr>
+            <w:tcW w:type="dxa" w:w="1788"/>
+            <w:vAlign w:val="center"/>
+            <w:tcMar>
+              <w:top w:w="75" w:type="dxa"/>
+              <w:left w:w="75" w:type="dxa"/>
+              <w:bottom w:w="75" w:type="dxa"/>
+              <w:right w:w="75" w:type="dxa"/>
+            </w:tcMar>
+            <w:shd w:fill="F5F7F8"/>
+          </w:tcPr>
+          <w:p>
+            <w:pPr>
+              <w:spacing w:after="20" w:before="20" w:line="269" w:lineRule="auto"/>
+            </w:pPr>
+            <w:r>
+              <w:rPr>
+                <w:b w:val="0"/>
+                <w:sz w:val="20"/>
+              </w:rPr>
+              <w:t>Fang等，2012，NHESS，DOI 10.5194/nhess-12-527-2012</w:t>
+            </w:r>
+          </w:p>
+        </w:tc>
+        <w:tc>
+          <w:tcPr>
+            <w:tcW w:type="dxa" w:w="2583"/>
+            <w:vAlign w:val="center"/>
+            <w:tcMar>
+              <w:top w:w="75" w:type="dxa"/>
+              <w:left w:w="75" w:type="dxa"/>
+              <w:bottom w:w="75" w:type="dxa"/>
+              <w:right w:w="75" w:type="dxa"/>
+            </w:tcMar>
+            <w:shd w:fill="F5F7F8"/>
+          </w:tcPr>
+          <w:p>
+            <w:pPr>
+              <w:spacing w:after="20" w:before="20" w:line="269" w:lineRule="auto"/>
+            </w:pPr>
+            <w:r>
+              <w:rPr>
+                <w:b w:val="0"/>
+                <w:sz w:val="20"/>
+              </w:rPr>
+              <w:t>室内槽中改变坡角、土料和含水状态进行降雨对照</w:t>
+            </w:r>
+          </w:p>
+        </w:tc>
+        <w:tc>
+          <w:tcPr>
+            <w:tcW w:type="dxa" w:w="2186"/>
+            <w:vAlign w:val="center"/>
+            <w:tcMar>
+              <w:top w:w="75" w:type="dxa"/>
+              <w:left w:w="75" w:type="dxa"/>
+              <w:bottom w:w="75" w:type="dxa"/>
+              <w:right w:w="75" w:type="dxa"/>
+            </w:tcMar>
+            <w:shd w:fill="F5F7F8"/>
+          </w:tcPr>
+          <w:p>
+            <w:pPr>
+              <w:spacing w:after="20" w:before="20" w:line="269" w:lineRule="auto"/>
+            </w:pPr>
+            <w:r>
+              <w:rPr>
+                <w:b w:val="0"/>
+                <w:sz w:val="20"/>
+              </w:rPr>
+              <w:t>将坡角、配方、初始含水率和密度作为独立试验因子；每次重建保留trial_id</w:t>
+            </w:r>
+          </w:p>
+        </w:tc>
+        <w:tc>
+          <w:tcPr>
+            <w:tcW w:type="dxa" w:w="3378"/>
+            <w:vAlign w:val="center"/>
+            <w:tcMar>
+              <w:top w:w="75" w:type="dxa"/>
+              <w:left w:w="75" w:type="dxa"/>
+              <w:bottom w:w="75" w:type="dxa"/>
+              <w:right w:w="75" w:type="dxa"/>
+            </w:tcMar>
+            <w:shd w:fill="F5F7F8"/>
+          </w:tcPr>
+          <w:p>
+            <w:pPr>
+              <w:spacing w:after="20" w:before="20" w:line="269" w:lineRule="auto"/>
+            </w:pPr>
+            <w:r>
+              <w:rPr>
+                <w:b w:val="0"/>
+                <w:sz w:val="20"/>
+              </w:rPr>
+              <w:t>不能证明1400 mm槽长或32°是唯一合理的最小尺寸</w:t>
+            </w:r>
+          </w:p>
+        </w:tc>
+      </w:tr>
+      <w:tr>
+        <w:trPr>
+          <w:cantSplit/>
+        </w:trPr>
+        <w:tc>
+          <w:tcPr>
+            <w:tcW w:type="dxa" w:w="1788"/>
+            <w:vAlign w:val="center"/>
+            <w:tcMar>
+              <w:top w:w="75" w:type="dxa"/>
+              <w:left w:w="75" w:type="dxa"/>
+              <w:bottom w:w="75" w:type="dxa"/>
+              <w:right w:w="75" w:type="dxa"/>
+            </w:tcMar>
+            <w:shd w:fill="FFFFFF"/>
+          </w:tcPr>
+          <w:p>
+            <w:pPr>
+              <w:spacing w:after="20" w:before="20" w:line="269" w:lineRule="auto"/>
+            </w:pPr>
+            <w:r>
+              <w:rPr>
+                <w:b w:val="0"/>
+                <w:sz w:val="20"/>
+              </w:rPr>
+              <w:t>Do等，2024，Geoenvironmental Disasters，DOI 10.1186/s40677-024-00280-x</w:t>
+            </w:r>
+          </w:p>
+        </w:tc>
+        <w:tc>
+          <w:tcPr>
+            <w:tcW w:type="dxa" w:w="2583"/>
+            <w:vAlign w:val="center"/>
+            <w:tcMar>
+              <w:top w:w="75" w:type="dxa"/>
+              <w:left w:w="75" w:type="dxa"/>
+              <w:bottom w:w="75" w:type="dxa"/>
+              <w:right w:w="75" w:type="dxa"/>
+            </w:tcMar>
+            <w:shd w:fill="FFFFFF"/>
+          </w:tcPr>
+          <w:p>
+            <w:pPr>
+              <w:spacing w:after="20" w:before="20" w:line="269" w:lineRule="auto"/>
+            </w:pPr>
+            <w:r>
+              <w:rPr>
+                <w:b w:val="0"/>
+                <w:sz w:val="20"/>
+              </w:rPr>
+              <w:t>风化花岗岩砂坡可在非完全饱和状态下发生降雨失稳</w:t>
+            </w:r>
+          </w:p>
+        </w:tc>
+        <w:tc>
+          <w:tcPr>
+            <w:tcW w:type="dxa" w:w="2186"/>
+            <w:vAlign w:val="center"/>
+            <w:tcMar>
+              <w:top w:w="75" w:type="dxa"/>
+              <w:left w:w="75" w:type="dxa"/>
+              <w:bottom w:w="75" w:type="dxa"/>
+              <w:right w:w="75" w:type="dxa"/>
+            </w:tcMar>
+            <w:shd w:fill="FFFFFF"/>
+          </w:tcPr>
+          <w:p>
+            <w:pPr>
+              <w:spacing w:after="20" w:before="20" w:line="269" w:lineRule="auto"/>
+            </w:pPr>
+            <w:r>
+              <w:rPr>
+                <w:b w:val="0"/>
+                <w:sz w:val="20"/>
+              </w:rPr>
+              <w:t>记录含水率、吸力/孔压、径流和湿润锋，不把“达到饱和”作为失稳前提</w:t>
+            </w:r>
+          </w:p>
+        </w:tc>
+        <w:tc>
+          <w:tcPr>
+            <w:tcW w:type="dxa" w:w="3378"/>
+            <w:vAlign w:val="center"/>
+            <w:tcMar>
+              <w:top w:w="75" w:type="dxa"/>
+              <w:left w:w="75" w:type="dxa"/>
+              <w:bottom w:w="75" w:type="dxa"/>
+              <w:right w:w="75" w:type="dxa"/>
+            </w:tcMar>
+            <w:shd w:fill="FFFFFF"/>
+          </w:tcPr>
+          <w:p>
+            <w:pPr>
+              <w:spacing w:after="20" w:before="20" w:line="269" w:lineRule="auto"/>
+            </w:pPr>
+            <w:r>
+              <w:rPr>
+                <w:b w:val="0"/>
+                <w:sz w:val="20"/>
+              </w:rPr>
+              <w:t>不能把9 m大型水槽的粒径、预湿时间和50 mm/h固定成小模型条件</w:t>
+            </w:r>
+          </w:p>
+        </w:tc>
+      </w:tr>
+      <w:tr>
+        <w:trPr>
+          <w:cantSplit/>
+        </w:trPr>
+        <w:tc>
+          <w:tcPr>
+            <w:tcW w:type="dxa" w:w="1788"/>
+            <w:vAlign w:val="center"/>
+            <w:tcMar>
+              <w:top w:w="75" w:type="dxa"/>
+              <w:left w:w="75" w:type="dxa"/>
+              <w:bottom w:w="75" w:type="dxa"/>
+              <w:right w:w="75" w:type="dxa"/>
+            </w:tcMar>
+            <w:shd w:fill="F5F7F8"/>
+          </w:tcPr>
+          <w:p>
+            <w:pPr>
+              <w:spacing w:after="20" w:before="20" w:line="269" w:lineRule="auto"/>
+            </w:pPr>
+            <w:r>
+              <w:rPr>
+                <w:b w:val="0"/>
+                <w:sz w:val="20"/>
+              </w:rPr>
+              <w:t>Wang和Sassa，2001，Géotechnique，DOI 10.1680/geot.2001.51.7.587</w:t>
+            </w:r>
+          </w:p>
+        </w:tc>
+        <w:tc>
+          <w:tcPr>
+            <w:tcW w:type="dxa" w:w="2583"/>
+            <w:vAlign w:val="center"/>
+            <w:tcMar>
+              <w:top w:w="75" w:type="dxa"/>
+              <w:left w:w="75" w:type="dxa"/>
+              <w:bottom w:w="75" w:type="dxa"/>
+              <w:right w:w="75" w:type="dxa"/>
+            </w:tcMar>
+            <w:shd w:fill="F5F7F8"/>
+          </w:tcPr>
+          <w:p>
+            <w:pPr>
+              <w:spacing w:after="20" w:before="20" w:line="269" w:lineRule="auto"/>
+            </w:pPr>
+            <w:r>
+              <w:rPr>
+                <w:b w:val="0"/>
+                <w:sz w:val="20"/>
+              </w:rPr>
+              <w:t>密度、细料和层厚会改变降雨流滑响应</w:t>
+            </w:r>
+          </w:p>
+        </w:tc>
+        <w:tc>
+          <w:tcPr>
+            <w:tcW w:type="dxa" w:w="2186"/>
+            <w:vAlign w:val="center"/>
+            <w:tcMar>
+              <w:top w:w="75" w:type="dxa"/>
+              <w:left w:w="75" w:type="dxa"/>
+              <w:bottom w:w="75" w:type="dxa"/>
+              <w:right w:w="75" w:type="dxa"/>
+            </w:tcMar>
+            <w:shd w:fill="F5F7F8"/>
+          </w:tcPr>
+          <w:p>
+            <w:pPr>
+              <w:spacing w:after="20" w:before="20" w:line="269" w:lineRule="auto"/>
+            </w:pPr>
+            <w:r>
+              <w:rPr>
+                <w:b w:val="0"/>
+                <w:sz w:val="20"/>
+              </w:rPr>
+              <w:t>首轮小试分别改变干密度、细料比例和层厚，测剪切/渗透后再选正式配方</w:t>
+            </w:r>
+          </w:p>
+        </w:tc>
+        <w:tc>
+          <w:tcPr>
+            <w:tcW w:type="dxa" w:w="3378"/>
+            <w:vAlign w:val="center"/>
+            <w:tcMar>
+              <w:top w:w="75" w:type="dxa"/>
+              <w:left w:w="75" w:type="dxa"/>
+              <w:bottom w:w="75" w:type="dxa"/>
+              <w:right w:w="75" w:type="dxa"/>
+            </w:tcMar>
+            <w:shd w:fill="F5F7F8"/>
+          </w:tcPr>
+          <w:p>
+            <w:pPr>
+              <w:spacing w:after="20" w:before="20" w:line="269" w:lineRule="auto"/>
+            </w:pPr>
+            <w:r>
+              <w:rPr>
+                <w:b w:val="0"/>
+                <w:sz w:val="20"/>
+              </w:rPr>
+              <w:t>不能把摘要中的变量关系换算成A5、A10或B30的精确最佳配比</w:t>
+            </w:r>
+          </w:p>
+        </w:tc>
+      </w:tr>
+      <w:tr>
+        <w:trPr>
+          <w:cantSplit/>
+        </w:trPr>
+        <w:tc>
+          <w:tcPr>
+            <w:tcW w:type="dxa" w:w="1788"/>
+            <w:vAlign w:val="center"/>
+            <w:tcMar>
+              <w:top w:w="75" w:type="dxa"/>
+              <w:left w:w="75" w:type="dxa"/>
+              <w:bottom w:w="75" w:type="dxa"/>
+              <w:right w:w="75" w:type="dxa"/>
+            </w:tcMar>
+            <w:shd w:fill="FFFFFF"/>
+          </w:tcPr>
+          <w:p>
+            <w:pPr>
+              <w:spacing w:after="20" w:before="20" w:line="269" w:lineRule="auto"/>
+            </w:pPr>
+            <w:r>
+              <w:rPr>
+                <w:b w:val="0"/>
+                <w:sz w:val="20"/>
+              </w:rPr>
+              <w:t>Zhu、Shi和Zhang，2017，Sensors，DOI 10.3390/s17030452</w:t>
+            </w:r>
+          </w:p>
+        </w:tc>
+        <w:tc>
+          <w:tcPr>
+            <w:tcW w:type="dxa" w:w="2583"/>
+            <w:vAlign w:val="center"/>
+            <w:tcMar>
+              <w:top w:w="75" w:type="dxa"/>
+              <w:left w:w="75" w:type="dxa"/>
+              <w:bottom w:w="75" w:type="dxa"/>
+              <w:right w:w="75" w:type="dxa"/>
+            </w:tcMar>
+            <w:shd w:fill="FFFFFF"/>
+          </w:tcPr>
+          <w:p>
+            <w:pPr>
+              <w:spacing w:after="20" w:before="20" w:line="269" w:lineRule="auto"/>
+            </w:pPr>
+            <w:r>
+              <w:rPr>
+                <w:b w:val="0"/>
+                <w:sz w:val="20"/>
+              </w:rPr>
+              <w:t>FBG地质灾害监测需考虑温度补偿、封装传力和岩土耦合</w:t>
+            </w:r>
+          </w:p>
+        </w:tc>
+        <w:tc>
+          <w:tcPr>
+            <w:tcW w:type="dxa" w:w="2186"/>
+            <w:vAlign w:val="center"/>
+            <w:tcMar>
+              <w:top w:w="75" w:type="dxa"/>
+              <w:left w:w="75" w:type="dxa"/>
+              <w:bottom w:w="75" w:type="dxa"/>
+              <w:right w:w="75" w:type="dxa"/>
+            </w:tcMar>
+            <w:shd w:fill="FFFFFF"/>
+          </w:tcPr>
+          <w:p>
+            <w:pPr>
+              <w:spacing w:after="20" w:before="20" w:line="269" w:lineRule="auto"/>
+            </w:pPr>
+            <w:r>
+              <w:rPr>
+                <w:b w:val="0"/>
+                <w:sz w:val="20"/>
+              </w:rPr>
+              <w:t>设置温度参考、传力短条、铠装分区、静态标定和湿态复测</w:t>
+            </w:r>
+          </w:p>
+        </w:tc>
+        <w:tc>
+          <w:tcPr>
+            <w:tcW w:type="dxa" w:w="3378"/>
+            <w:vAlign w:val="center"/>
+            <w:tcMar>
+              <w:top w:w="75" w:type="dxa"/>
+              <w:left w:w="75" w:type="dxa"/>
+              <w:bottom w:w="75" w:type="dxa"/>
+              <w:right w:w="75" w:type="dxa"/>
+            </w:tcMar>
+            <w:shd w:fill="FFFFFF"/>
+          </w:tcPr>
+          <w:p>
+            <w:pPr>
+              <w:spacing w:after="20" w:before="20" w:line="269" w:lineRule="auto"/>
+            </w:pPr>
+            <w:r>
+              <w:rPr>
+                <w:b w:val="0"/>
+                <w:sz w:val="20"/>
+              </w:rPr>
+              <w:t>不能从综述得到本项目的埋深、标距或微应变报警值</w:t>
+            </w:r>
+          </w:p>
+        </w:tc>
+      </w:tr>
+      <w:tr>
+        <w:trPr>
+          <w:cantSplit/>
+        </w:trPr>
+        <w:tc>
+          <w:tcPr>
+            <w:tcW w:type="dxa" w:w="1788"/>
+            <w:vAlign w:val="center"/>
+            <w:tcMar>
+              <w:top w:w="75" w:type="dxa"/>
+              <w:left w:w="75" w:type="dxa"/>
+              <w:bottom w:w="75" w:type="dxa"/>
+              <w:right w:w="75" w:type="dxa"/>
+            </w:tcMar>
+            <w:shd w:fill="F5F7F8"/>
+          </w:tcPr>
+          <w:p>
+            <w:pPr>
+              <w:spacing w:after="20" w:before="20" w:line="269" w:lineRule="auto"/>
+            </w:pPr>
+            <w:r>
+              <w:rPr>
+                <w:b w:val="0"/>
+                <w:sz w:val="20"/>
+              </w:rPr>
+              <w:t>Bastianini等，2019，Sensors，DOI 10.3390/s19235172</w:t>
+            </w:r>
+          </w:p>
+        </w:tc>
+        <w:tc>
+          <w:tcPr>
+            <w:tcW w:type="dxa" w:w="2583"/>
+            <w:vAlign w:val="center"/>
+            <w:tcMar>
+              <w:top w:w="75" w:type="dxa"/>
+              <w:left w:w="75" w:type="dxa"/>
+              <w:bottom w:w="75" w:type="dxa"/>
+              <w:right w:w="75" w:type="dxa"/>
+            </w:tcMar>
+            <w:shd w:fill="F5F7F8"/>
+          </w:tcPr>
+          <w:p>
+            <w:pPr>
+              <w:spacing w:after="20" w:before="20" w:line="269" w:lineRule="auto"/>
+            </w:pPr>
+            <w:r>
+              <w:rPr>
+                <w:b w:val="0"/>
+                <w:sz w:val="20"/>
+              </w:rPr>
+              <w:t>护套、机械耦合和应变传递会影响光纤测量</w:t>
+            </w:r>
+          </w:p>
+        </w:tc>
+        <w:tc>
+          <w:tcPr>
+            <w:tcW w:type="dxa" w:w="2186"/>
+            <w:vAlign w:val="center"/>
+            <w:tcMar>
+              <w:top w:w="75" w:type="dxa"/>
+              <w:left w:w="75" w:type="dxa"/>
+              <w:bottom w:w="75" w:type="dxa"/>
+              <w:right w:w="75" w:type="dxa"/>
+            </w:tcMar>
+            <w:shd w:fill="F5F7F8"/>
+          </w:tcPr>
+          <w:p>
+            <w:pPr>
+              <w:spacing w:after="20" w:before="20" w:line="269" w:lineRule="auto"/>
+            </w:pPr>
+            <w:r>
+              <w:rPr>
+                <w:b w:val="0"/>
+                <w:sz w:val="20"/>
+              </w:rPr>
+              <w:t>将传感段、过渡段和自由引线分区，安装后用已知位移/弯曲复核</w:t>
+            </w:r>
+          </w:p>
+        </w:tc>
+        <w:tc>
+          <w:tcPr>
+            <w:tcW w:type="dxa" w:w="3378"/>
+            <w:vAlign w:val="center"/>
+            <w:tcMar>
+              <w:top w:w="75" w:type="dxa"/>
+              <w:left w:w="75" w:type="dxa"/>
+              <w:bottom w:w="75" w:type="dxa"/>
+              <w:right w:w="75" w:type="dxa"/>
+            </w:tcMar>
+            <w:shd w:fill="F5F7F8"/>
+          </w:tcPr>
+          <w:p>
+            <w:pPr>
+              <w:spacing w:after="20" w:before="20" w:line="269" w:lineRule="auto"/>
+            </w:pPr>
+            <w:r>
+              <w:rPr>
+                <w:b w:val="0"/>
+                <w:sz w:val="20"/>
+              </w:rPr>
+              <w:t>分布式布里渊电缆的系数不能直接用于离散FBG</w:t>
+            </w:r>
+          </w:p>
+        </w:tc>
+      </w:tr>
+      <w:tr>
+        <w:trPr>
+          <w:cantSplit/>
+        </w:trPr>
+        <w:tc>
+          <w:tcPr>
+            <w:tcW w:type="dxa" w:w="1788"/>
+            <w:vAlign w:val="center"/>
+            <w:tcMar>
+              <w:top w:w="75" w:type="dxa"/>
+              <w:left w:w="75" w:type="dxa"/>
+              <w:bottom w:w="75" w:type="dxa"/>
+              <w:right w:w="75" w:type="dxa"/>
+            </w:tcMar>
+            <w:shd w:fill="FFFFFF"/>
+          </w:tcPr>
+          <w:p>
+            <w:pPr>
+              <w:spacing w:after="20" w:before="20" w:line="269" w:lineRule="auto"/>
+            </w:pPr>
+            <w:r>
+              <w:rPr>
+                <w:b w:val="0"/>
+                <w:sz w:val="20"/>
+              </w:rPr>
+              <w:t>GB/T 50123《土工试验方法标准》（执行时核对现行版本）</w:t>
+            </w:r>
+          </w:p>
+        </w:tc>
+        <w:tc>
+          <w:tcPr>
+            <w:tcW w:type="dxa" w:w="2583"/>
+            <w:vAlign w:val="center"/>
+            <w:tcMar>
+              <w:top w:w="75" w:type="dxa"/>
+              <w:left w:w="75" w:type="dxa"/>
+              <w:bottom w:w="75" w:type="dxa"/>
+              <w:right w:w="75" w:type="dxa"/>
+            </w:tcMar>
+            <w:shd w:fill="FFFFFF"/>
+          </w:tcPr>
+          <w:p>
+            <w:pPr>
+              <w:spacing w:after="20" w:before="20" w:line="269" w:lineRule="auto"/>
+            </w:pPr>
+            <w:r>
+              <w:rPr>
+                <w:b w:val="0"/>
+                <w:sz w:val="20"/>
+              </w:rPr>
+              <w:t>含水率、颗粒级配、密度、渗透和剪切等试验的通用方法框架</w:t>
+            </w:r>
+          </w:p>
+        </w:tc>
+        <w:tc>
+          <w:tcPr>
+            <w:tcW w:type="dxa" w:w="2186"/>
+            <w:vAlign w:val="center"/>
+            <w:tcMar>
+              <w:top w:w="75" w:type="dxa"/>
+              <w:left w:w="75" w:type="dxa"/>
+              <w:bottom w:w="75" w:type="dxa"/>
+              <w:right w:w="75" w:type="dxa"/>
+            </w:tcMar>
+            <w:shd w:fill="FFFFFF"/>
+          </w:tcPr>
+          <w:p>
+            <w:pPr>
+              <w:spacing w:after="20" w:before="20" w:line="269" w:lineRule="auto"/>
+            </w:pPr>
+            <w:r>
+              <w:rPr>
+                <w:b w:val="0"/>
+                <w:sz w:val="20"/>
+              </w:rPr>
+              <w:t>采购、制样和验收按适用试验方法记录原始数据、设备和不确定度</w:t>
+            </w:r>
+          </w:p>
+        </w:tc>
+        <w:tc>
+          <w:tcPr>
+            <w:tcW w:type="dxa" w:w="3378"/>
+            <w:vAlign w:val="center"/>
+            <w:tcMar>
+              <w:top w:w="75" w:type="dxa"/>
+              <w:left w:w="75" w:type="dxa"/>
+              <w:bottom w:w="75" w:type="dxa"/>
+              <w:right w:w="75" w:type="dxa"/>
+            </w:tcMar>
+            <w:shd w:fill="FFFFFF"/>
+          </w:tcPr>
+          <w:p>
+            <w:pPr>
+              <w:spacing w:after="20" w:before="20" w:line="269" w:lineRule="auto"/>
+            </w:pPr>
+            <w:r>
+              <w:rPr>
+                <w:b w:val="0"/>
+                <w:sz w:val="20"/>
+              </w:rPr>
+              <w:t>该标准不提供本模型的滑坡阈值，也不替代结构承载验算</w:t>
+            </w:r>
+          </w:p>
+        </w:tc>
+      </w:tr>
+      <w:tr>
+        <w:trPr>
+          <w:cantSplit/>
+        </w:trPr>
+        <w:tc>
+          <w:tcPr>
+            <w:tcW w:type="dxa" w:w="1788"/>
+            <w:vAlign w:val="center"/>
+            <w:tcMar>
+              <w:top w:w="75" w:type="dxa"/>
+              <w:left w:w="75" w:type="dxa"/>
+              <w:bottom w:w="75" w:type="dxa"/>
+              <w:right w:w="75" w:type="dxa"/>
+            </w:tcMar>
+            <w:shd w:fill="F5F7F8"/>
+          </w:tcPr>
+          <w:p>
+            <w:pPr>
+              <w:spacing w:after="20" w:before="20" w:line="269" w:lineRule="auto"/>
+            </w:pPr>
+            <w:r>
+              <w:rPr>
+                <w:b w:val="0"/>
+                <w:sz w:val="20"/>
+              </w:rPr>
+              <w:t>GB 50330《建筑边坡工程技术规范》（执行时核对现行版本）</w:t>
+            </w:r>
+          </w:p>
+        </w:tc>
+        <w:tc>
+          <w:tcPr>
+            <w:tcW w:type="dxa" w:w="2583"/>
+            <w:vAlign w:val="center"/>
+            <w:tcMar>
+              <w:top w:w="75" w:type="dxa"/>
+              <w:left w:w="75" w:type="dxa"/>
+              <w:bottom w:w="75" w:type="dxa"/>
+              <w:right w:w="75" w:type="dxa"/>
+            </w:tcMar>
+            <w:shd w:fill="F5F7F8"/>
+          </w:tcPr>
+          <w:p>
+            <w:pPr>
+              <w:spacing w:after="20" w:before="20" w:line="269" w:lineRule="auto"/>
+            </w:pPr>
+            <w:r>
+              <w:rPr>
+                <w:b w:val="0"/>
+                <w:sz w:val="20"/>
+              </w:rPr>
+              <w:t>工程边坡的勘察、设计、监测项目和风险分级思路</w:t>
+            </w:r>
+          </w:p>
+        </w:tc>
+        <w:tc>
+          <w:tcPr>
+            <w:tcW w:type="dxa" w:w="2186"/>
+            <w:vAlign w:val="center"/>
+            <w:tcMar>
+              <w:top w:w="75" w:type="dxa"/>
+              <w:left w:w="75" w:type="dxa"/>
+              <w:bottom w:w="75" w:type="dxa"/>
+              <w:right w:w="75" w:type="dxa"/>
+            </w:tcMar>
+            <w:shd w:fill="F5F7F8"/>
+          </w:tcPr>
+          <w:p>
+            <w:pPr>
+              <w:spacing w:after="20" w:before="20" w:line="269" w:lineRule="auto"/>
+            </w:pPr>
+            <w:r>
+              <w:rPr>
+                <w:b w:val="0"/>
+                <w:sz w:val="20"/>
+              </w:rPr>
+              <w:t>借鉴监测项目分类，建立位移、地下水/含水、降雨、裂缝和视频的多证据记录</w:t>
+            </w:r>
+          </w:p>
+        </w:tc>
+        <w:tc>
+          <w:tcPr>
+            <w:tcW w:type="dxa" w:w="3378"/>
+            <w:vAlign w:val="center"/>
+            <w:tcMar>
+              <w:top w:w="75" w:type="dxa"/>
+              <w:left w:w="75" w:type="dxa"/>
+              <w:bottom w:w="75" w:type="dxa"/>
+              <w:right w:w="75" w:type="dxa"/>
+            </w:tcMar>
+            <w:shd w:fill="F5F7F8"/>
+          </w:tcPr>
+          <w:p>
+            <w:pPr>
+              <w:spacing w:after="20" w:before="20" w:line="269" w:lineRule="auto"/>
+            </w:pPr>
+            <w:r>
+              <w:rPr>
+                <w:b w:val="0"/>
+                <w:sz w:val="20"/>
+              </w:rPr>
+              <w:t>工程安全系数和预警值不能直接当作室内缩尺模型判据</w:t>
+            </w:r>
+          </w:p>
+        </w:tc>
+      </w:tr>
+    </w:tbl>
+    <w:p>
+      <w:pPr>
+        <w:spacing w:after="40"/>
+      </w:pPr>
+    </w:p>
+    <w:p>
+      <w:pPr>
+        <w:pStyle w:val="Heading1"/>
+      </w:pPr>
+      <w:r>
+        <w:t>17 制造评价标准与放行判据</w:t>
+      </w:r>
+    </w:p>
+    <w:p>
+      <w:r>
+        <w:t>下表是制造批次的可执行验收单。表中“项目建议”不是国家标准；在先导批次完成后，必须用实测离散性复核并锁定为配置文件中的版本化阈值。任何一项未通过都只能进入调试库，不能作为正式算法性能样本。</w:t>
+      </w:r>
+    </w:p>
+    <w:tbl>
+      <w:tblPr>
+        <w:tblW w:type="auto" w:w="0"/>
+        <w:jc w:val="center"/>
+        <w:tblLayout w:type="fixed"/>
+        <w:tblLook w:firstColumn="1" w:firstRow="1" w:lastColumn="0" w:lastRow="0" w:noHBand="0" w:noVBand="1" w:val="04A0"/>
+        <w:tblBorders>
+          <w:top w:val="single" w:sz="4" w:color="D9D9D9"/>
+          <w:left w:val="single" w:sz="4" w:color="D9D9D9"/>
+          <w:bottom w:val="single" w:sz="4" w:color="D9D9D9"/>
+          <w:right w:val="single" w:sz="4" w:color="D9D9D9"/>
+          <w:insideH w:val="single" w:sz="4" w:color="D9D9D9"/>
+          <w:insideV w:val="single" w:sz="4" w:color="D9D9D9"/>
+        </w:tblBorders>
+      </w:tblPr>
+      <w:tblGrid>
+        <w:gridCol w:w="1788"/>
+        <w:gridCol w:w="2583"/>
+        <w:gridCol w:w="2186"/>
+        <w:gridCol w:w="3378"/>
+      </w:tblGrid>
+      <w:tr>
+        <w:trPr>
+          <w:tblHeader/>
+          <w:cantSplit/>
+        </w:trPr>
+        <w:tc>
+          <w:tcPr>
+            <w:tcW w:type="dxa" w:w="1788"/>
+            <w:vAlign w:val="center"/>
+            <w:tcMar>
+              <w:top w:w="75" w:type="dxa"/>
+              <w:left w:w="75" w:type="dxa"/>
+              <w:bottom w:w="75" w:type="dxa"/>
+              <w:right w:w="75" w:type="dxa"/>
+            </w:tcMar>
+            <w:shd w:fill="DCE8EE"/>
+          </w:tcPr>
+          <w:p>
+            <w:pPr>
+              <w:keepNext/>
+              <w:spacing w:after="20" w:before="20" w:line="269" w:lineRule="auto"/>
+              <w:jc w:val="center"/>
+            </w:pPr>
+            <w:r>
+              <w:rPr>
+                <w:b/>
+                <w:sz w:val="20"/>
+              </w:rPr>
+              <w:t>检查对象</w:t>
+            </w:r>
+          </w:p>
+        </w:tc>
+        <w:tc>
+          <w:tcPr>
+            <w:tcW w:type="dxa" w:w="2583"/>
+            <w:vAlign w:val="center"/>
+            <w:tcMar>
+              <w:top w:w="75" w:type="dxa"/>
+              <w:left w:w="75" w:type="dxa"/>
+              <w:bottom w:w="75" w:type="dxa"/>
+              <w:right w:w="75" w:type="dxa"/>
+            </w:tcMar>
+            <w:shd w:fill="DCE8EE"/>
+          </w:tcPr>
+          <w:p>
+            <w:pPr>
+              <w:keepNext/>
+              <w:spacing w:after="20" w:before="20" w:line="269" w:lineRule="auto"/>
+              <w:jc w:val="center"/>
+            </w:pPr>
+            <w:r>
+              <w:rPr>
+                <w:b/>
+                <w:sz w:val="20"/>
+              </w:rPr>
+              <w:t>检查方法与证据</w:t>
+            </w:r>
+          </w:p>
+        </w:tc>
+        <w:tc>
+          <w:tcPr>
+            <w:tcW w:type="dxa" w:w="2186"/>
+            <w:vAlign w:val="center"/>
+            <w:tcMar>
+              <w:top w:w="75" w:type="dxa"/>
+              <w:left w:w="75" w:type="dxa"/>
+              <w:bottom w:w="75" w:type="dxa"/>
+              <w:right w:w="75" w:type="dxa"/>
+            </w:tcMar>
+            <w:shd w:fill="DCE8EE"/>
+          </w:tcPr>
+          <w:p>
+            <w:pPr>
+              <w:keepNext/>
+              <w:spacing w:after="20" w:before="20" w:line="269" w:lineRule="auto"/>
+              <w:jc w:val="center"/>
+            </w:pPr>
+            <w:r>
+              <w:rPr>
+                <w:b/>
+                <w:sz w:val="20"/>
+              </w:rPr>
+              <w:t>首轮项目建议放行线</w:t>
+            </w:r>
+          </w:p>
+        </w:tc>
+        <w:tc>
+          <w:tcPr>
+            <w:tcW w:type="dxa" w:w="3378"/>
+            <w:vAlign w:val="center"/>
+            <w:tcMar>
+              <w:top w:w="75" w:type="dxa"/>
+              <w:left w:w="75" w:type="dxa"/>
+              <w:bottom w:w="75" w:type="dxa"/>
+              <w:right w:w="75" w:type="dxa"/>
+            </w:tcMar>
+            <w:shd w:fill="DCE8EE"/>
+          </w:tcPr>
+          <w:p>
+            <w:pPr>
+              <w:keepNext/>
+              <w:spacing w:after="20" w:before="20" w:line="269" w:lineRule="auto"/>
+              <w:jc w:val="center"/>
+            </w:pPr>
+            <w:r>
+              <w:rPr>
+                <w:b/>
+                <w:sz w:val="20"/>
+              </w:rPr>
+              <w:t>判定与后续动作</w:t>
+            </w:r>
+          </w:p>
+        </w:tc>
+      </w:tr>
+      <w:tr>
+        <w:trPr>
+          <w:cantSplit/>
+        </w:trPr>
+        <w:tc>
+          <w:tcPr>
+            <w:tcW w:type="dxa" w:w="1788"/>
+            <w:vAlign w:val="center"/>
+            <w:tcMar>
+              <w:top w:w="75" w:type="dxa"/>
+              <w:left w:w="75" w:type="dxa"/>
+              <w:bottom w:w="75" w:type="dxa"/>
+              <w:right w:w="75" w:type="dxa"/>
+            </w:tcMar>
+            <w:shd w:fill="FFFFFF"/>
+          </w:tcPr>
+          <w:p>
+            <w:pPr>
+              <w:spacing w:after="20" w:before="20" w:line="269" w:lineRule="auto"/>
+              <w:jc w:val="center"/>
+            </w:pPr>
+            <w:r>
+              <w:rPr>
+                <w:b w:val="0"/>
+                <w:sz w:val="20"/>
+              </w:rPr>
+              <w:t>槽体和坡角</w:t>
+            </w:r>
+          </w:p>
+        </w:tc>
+        <w:tc>
+          <w:tcPr>
+            <w:tcW w:type="dxa" w:w="2583"/>
+            <w:vAlign w:val="center"/>
+            <w:tcMar>
+              <w:top w:w="75" w:type="dxa"/>
+              <w:left w:w="75" w:type="dxa"/>
+              <w:bottom w:w="75" w:type="dxa"/>
+              <w:right w:w="75" w:type="dxa"/>
+            </w:tcMar>
+            <w:shd w:fill="FFFFFF"/>
+          </w:tcPr>
+          <w:p>
+            <w:pPr>
+              <w:spacing w:after="20" w:before="20" w:line="269" w:lineRule="auto"/>
+            </w:pPr>
+            <w:r>
+              <w:rPr>
+                <w:b w:val="0"/>
+                <w:sz w:val="20"/>
+              </w:rPr>
+              <w:t>钢尺/卡尺、数字角度仪、四角和坡面网格测点、照片</w:t>
+            </w:r>
+          </w:p>
+        </w:tc>
+        <w:tc>
+          <w:tcPr>
+            <w:tcW w:type="dxa" w:w="2186"/>
+            <w:vAlign w:val="center"/>
+            <w:tcMar>
+              <w:top w:w="75" w:type="dxa"/>
+              <w:left w:w="75" w:type="dxa"/>
+              <w:bottom w:w="75" w:type="dxa"/>
+              <w:right w:w="75" w:type="dxa"/>
+            </w:tcMar>
+            <w:shd w:fill="FFFFFF"/>
+          </w:tcPr>
+          <w:p>
+            <w:pPr>
+              <w:spacing w:after="20" w:before="20" w:line="269" w:lineRule="auto"/>
+            </w:pPr>
+            <w:r>
+              <w:rPr>
+                <w:b w:val="0"/>
+                <w:sz w:val="20"/>
+              </w:rPr>
+              <w:t>净长宽高和承托位置±2 mm；坡角32°±0.3°；主动层和床层法向厚度±2 mm</w:t>
+            </w:r>
+          </w:p>
+        </w:tc>
+        <w:tc>
+          <w:tcPr>
+            <w:tcW w:type="dxa" w:w="3378"/>
+            <w:vAlign w:val="center"/>
+            <w:tcMar>
+              <w:top w:w="75" w:type="dxa"/>
+              <w:left w:w="75" w:type="dxa"/>
+              <w:bottom w:w="75" w:type="dxa"/>
+              <w:right w:w="75" w:type="dxa"/>
+            </w:tcMar>
+            <w:shd w:fill="FFFFFF"/>
+          </w:tcPr>
+          <w:p>
+            <w:pPr>
+              <w:spacing w:after="20" w:before="20" w:line="269" w:lineRule="auto"/>
+            </w:pPr>
+            <w:r>
+              <w:rPr>
+                <w:b w:val="0"/>
+                <w:sz w:val="20"/>
+              </w:rPr>
+              <w:t>超差先调平、重装或重铺，不能靠数据后处理修正</w:t>
+            </w:r>
+          </w:p>
+        </w:tc>
+      </w:tr>
+      <w:tr>
+        <w:trPr>
+          <w:cantSplit/>
+        </w:trPr>
+        <w:tc>
+          <w:tcPr>
+            <w:tcW w:type="dxa" w:w="1788"/>
+            <w:vAlign w:val="center"/>
+            <w:tcMar>
+              <w:top w:w="75" w:type="dxa"/>
+              <w:left w:w="75" w:type="dxa"/>
+              <w:bottom w:w="75" w:type="dxa"/>
+              <w:right w:w="75" w:type="dxa"/>
+            </w:tcMar>
+            <w:shd w:fill="F5F7F8"/>
+          </w:tcPr>
+          <w:p>
+            <w:pPr>
+              <w:spacing w:after="20" w:before="20" w:line="269" w:lineRule="auto"/>
+              <w:jc w:val="center"/>
+            </w:pPr>
+            <w:r>
+              <w:rPr>
+                <w:b w:val="0"/>
+                <w:sz w:val="20"/>
+              </w:rPr>
+              <w:t>级配和原料身份</w:t>
+            </w:r>
+          </w:p>
+        </w:tc>
+        <w:tc>
+          <w:tcPr>
+            <w:tcW w:type="dxa" w:w="2583"/>
+            <w:vAlign w:val="center"/>
+            <w:tcMar>
+              <w:top w:w="75" w:type="dxa"/>
+              <w:left w:w="75" w:type="dxa"/>
+              <w:bottom w:w="75" w:type="dxa"/>
+              <w:right w:w="75" w:type="dxa"/>
+            </w:tcMar>
+            <w:shd w:fill="F5F7F8"/>
+          </w:tcPr>
+          <w:p>
+            <w:pPr>
+              <w:spacing w:after="20" w:before="20" w:line="269" w:lineRule="auto"/>
+            </w:pPr>
+            <w:r>
+              <w:rPr>
+                <w:b w:val="0"/>
+                <w:sz w:val="20"/>
+              </w:rPr>
+              <w:t>按GB/T 50123适用方法筛分；记录批号、含水率和混合时间</w:t>
+            </w:r>
+          </w:p>
+        </w:tc>
+        <w:tc>
+          <w:tcPr>
+            <w:tcW w:type="dxa" w:w="2186"/>
+            <w:vAlign w:val="center"/>
+            <w:tcMar>
+              <w:top w:w="75" w:type="dxa"/>
+              <w:left w:w="75" w:type="dxa"/>
+              <w:bottom w:w="75" w:type="dxa"/>
+              <w:right w:w="75" w:type="dxa"/>
+            </w:tcMar>
+            <w:shd w:fill="F5F7F8"/>
+          </w:tcPr>
+          <w:p>
+            <w:pPr>
+              <w:spacing w:after="20" w:before="20" w:line="269" w:lineRule="auto"/>
+            </w:pPr>
+            <w:r>
+              <w:rPr>
+                <w:b w:val="0"/>
+                <w:sz w:val="20"/>
+              </w:rPr>
+              <w:t>各筛分级质量分数相对目标偏差先控制在±2个百分点；批号和筛余曲线齐全</w:t>
+            </w:r>
+          </w:p>
+        </w:tc>
+        <w:tc>
+          <w:tcPr>
+            <w:tcW w:type="dxa" w:w="3378"/>
+            <w:vAlign w:val="center"/>
+            <w:tcMar>
+              <w:top w:w="75" w:type="dxa"/>
+              <w:left w:w="75" w:type="dxa"/>
+              <w:bottom w:w="75" w:type="dxa"/>
+              <w:right w:w="75" w:type="dxa"/>
+            </w:tcMar>
+            <w:shd w:fill="F5F7F8"/>
+          </w:tcPr>
+          <w:p>
+            <w:pPr>
+              <w:spacing w:after="20" w:before="20" w:line="269" w:lineRule="auto"/>
+            </w:pPr>
+            <w:r>
+              <w:rPr>
+                <w:b w:val="0"/>
+                <w:sz w:val="20"/>
+              </w:rPr>
+              <w:t>不合格批次隔离；重新混料并保留旧批次记录</w:t>
+            </w:r>
+          </w:p>
+        </w:tc>
+      </w:tr>
+      <w:tr>
+        <w:trPr>
+          <w:cantSplit/>
+        </w:trPr>
+        <w:tc>
+          <w:tcPr>
+            <w:tcW w:type="dxa" w:w="1788"/>
+            <w:vAlign w:val="center"/>
+            <w:tcMar>
+              <w:top w:w="75" w:type="dxa"/>
+              <w:left w:w="75" w:type="dxa"/>
+              <w:bottom w:w="75" w:type="dxa"/>
+              <w:right w:w="75" w:type="dxa"/>
+            </w:tcMar>
+            <w:shd w:fill="FFFFFF"/>
+          </w:tcPr>
+          <w:p>
+            <w:pPr>
+              <w:spacing w:after="20" w:before="20" w:line="269" w:lineRule="auto"/>
+              <w:jc w:val="center"/>
+            </w:pPr>
+            <w:r>
+              <w:rPr>
+                <w:b w:val="0"/>
+                <w:sz w:val="20"/>
+              </w:rPr>
+              <w:t>含水率</w:t>
+            </w:r>
+          </w:p>
+        </w:tc>
+        <w:tc>
+          <w:tcPr>
+            <w:tcW w:type="dxa" w:w="2583"/>
+            <w:vAlign w:val="center"/>
+            <w:tcMar>
+              <w:top w:w="75" w:type="dxa"/>
+              <w:left w:w="75" w:type="dxa"/>
+              <w:bottom w:w="75" w:type="dxa"/>
+              <w:right w:w="75" w:type="dxa"/>
+            </w:tcMar>
+            <w:shd w:fill="FFFFFF"/>
+          </w:tcPr>
+          <w:p>
+            <w:pPr>
+              <w:spacing w:after="20" w:before="20" w:line="269" w:lineRule="auto"/>
+            </w:pPr>
+            <w:r>
+              <w:rPr>
+                <w:b w:val="0"/>
+                <w:sz w:val="20"/>
+              </w:rPr>
+              <w:t>分层取样烘干或等效经校准方法；至少三点/层</w:t>
+            </w:r>
+          </w:p>
+        </w:tc>
+        <w:tc>
+          <w:tcPr>
+            <w:tcW w:type="dxa" w:w="2186"/>
+            <w:vAlign w:val="center"/>
+            <w:tcMar>
+              <w:top w:w="75" w:type="dxa"/>
+              <w:left w:w="75" w:type="dxa"/>
+              <w:bottom w:w="75" w:type="dxa"/>
+              <w:right w:w="75" w:type="dxa"/>
+            </w:tcMar>
+            <w:shd w:fill="FFFFFF"/>
+          </w:tcPr>
+          <w:p>
+            <w:pPr>
+              <w:spacing w:after="20" w:before="20" w:line="269" w:lineRule="auto"/>
+            </w:pPr>
+            <w:r>
+              <w:rPr>
+                <w:b w:val="0"/>
+                <w:sz w:val="20"/>
+              </w:rPr>
+              <w:t>与目标值绝对偏差不大于0.5个百分点，或按先导实测重复性修订</w:t>
+            </w:r>
+          </w:p>
+        </w:tc>
+        <w:tc>
+          <w:tcPr>
+            <w:tcW w:type="dxa" w:w="3378"/>
+            <w:vAlign w:val="center"/>
+            <w:tcMar>
+              <w:top w:w="75" w:type="dxa"/>
+              <w:left w:w="75" w:type="dxa"/>
+              <w:bottom w:w="75" w:type="dxa"/>
+              <w:right w:w="75" w:type="dxa"/>
+            </w:tcMar>
+            <w:shd w:fill="FFFFFF"/>
+          </w:tcPr>
+          <w:p>
+            <w:pPr>
+              <w:spacing w:after="20" w:before="20" w:line="269" w:lineRule="auto"/>
+            </w:pPr>
+            <w:r>
+              <w:rPr>
+                <w:b w:val="0"/>
+                <w:sz w:val="20"/>
+              </w:rPr>
+              <w:t>超差层不得直接埋纤；复拌、密封平衡后复测</w:t>
+            </w:r>
+          </w:p>
+        </w:tc>
+      </w:tr>
+      <w:tr>
+        <w:trPr>
+          <w:cantSplit/>
+        </w:trPr>
+        <w:tc>
+          <w:tcPr>
+            <w:tcW w:type="dxa" w:w="1788"/>
+            <w:vAlign w:val="center"/>
+            <w:tcMar>
+              <w:top w:w="75" w:type="dxa"/>
+              <w:left w:w="75" w:type="dxa"/>
+              <w:bottom w:w="75" w:type="dxa"/>
+              <w:right w:w="75" w:type="dxa"/>
+            </w:tcMar>
+            <w:shd w:fill="F5F7F8"/>
+          </w:tcPr>
+          <w:p>
+            <w:pPr>
+              <w:spacing w:after="20" w:before="20" w:line="269" w:lineRule="auto"/>
+              <w:jc w:val="center"/>
+            </w:pPr>
+            <w:r>
+              <w:rPr>
+                <w:b w:val="0"/>
+                <w:sz w:val="20"/>
+              </w:rPr>
+              <w:t>干密度和铺层厚度</w:t>
+            </w:r>
+          </w:p>
+        </w:tc>
+        <w:tc>
+          <w:tcPr>
+            <w:tcW w:type="dxa" w:w="2583"/>
+            <w:vAlign w:val="center"/>
+            <w:tcMar>
+              <w:top w:w="75" w:type="dxa"/>
+              <w:left w:w="75" w:type="dxa"/>
+              <w:bottom w:w="75" w:type="dxa"/>
+              <w:right w:w="75" w:type="dxa"/>
+            </w:tcMar>
+            <w:shd w:fill="F5F7F8"/>
+          </w:tcPr>
+          <w:p>
+            <w:pPr>
+              <w:spacing w:after="20" w:before="20" w:line="269" w:lineRule="auto"/>
+            </w:pPr>
+            <w:r>
+              <w:rPr>
+                <w:b w:val="0"/>
+                <w:sz w:val="20"/>
+              </w:rPr>
+              <w:t>称量、体积反算并抽样复核；记录夯实遍数和工具</w:t>
+            </w:r>
+          </w:p>
+        </w:tc>
+        <w:tc>
+          <w:tcPr>
+            <w:tcW w:type="dxa" w:w="2186"/>
+            <w:vAlign w:val="center"/>
+            <w:tcMar>
+              <w:top w:w="75" w:type="dxa"/>
+              <w:left w:w="75" w:type="dxa"/>
+              <w:bottom w:w="75" w:type="dxa"/>
+              <w:right w:w="75" w:type="dxa"/>
+            </w:tcMar>
+            <w:shd w:fill="F5F7F8"/>
+          </w:tcPr>
+          <w:p>
+            <w:pPr>
+              <w:spacing w:after="20" w:before="20" w:line="269" w:lineRule="auto"/>
+            </w:pPr>
+            <w:r>
+              <w:rPr>
+                <w:b w:val="0"/>
+                <w:sz w:val="20"/>
+              </w:rPr>
+              <w:t>干密度相对目标偏差不大于±2%；每层法向厚度±2 mm；同层CV不大于5%</w:t>
+            </w:r>
+          </w:p>
+        </w:tc>
+        <w:tc>
+          <w:tcPr>
+            <w:tcW w:type="dxa" w:w="3378"/>
+            <w:vAlign w:val="center"/>
+            <w:tcMar>
+              <w:top w:w="75" w:type="dxa"/>
+              <w:left w:w="75" w:type="dxa"/>
+              <w:bottom w:w="75" w:type="dxa"/>
+              <w:right w:w="75" w:type="dxa"/>
+            </w:tcMar>
+            <w:shd w:fill="F5F7F8"/>
+          </w:tcPr>
+          <w:p>
+            <w:pPr>
+              <w:spacing w:after="20" w:before="20" w:line="269" w:lineRule="auto"/>
+            </w:pPr>
+            <w:r>
+              <w:rPr>
+                <w:b w:val="0"/>
+                <w:sz w:val="20"/>
+              </w:rPr>
+              <w:t>超差层刮平或拆除重铺，不以平均值掩盖局部空洞</w:t>
+            </w:r>
+          </w:p>
+        </w:tc>
+      </w:tr>
+      <w:tr>
+        <w:trPr>
+          <w:cantSplit/>
+        </w:trPr>
+        <w:tc>
+          <w:tcPr>
+            <w:tcW w:type="dxa" w:w="1788"/>
+            <w:vAlign w:val="center"/>
+            <w:tcMar>
+              <w:top w:w="75" w:type="dxa"/>
+              <w:left w:w="75" w:type="dxa"/>
+              <w:bottom w:w="75" w:type="dxa"/>
+              <w:right w:w="75" w:type="dxa"/>
+            </w:tcMar>
+            <w:shd w:fill="FFFFFF"/>
+          </w:tcPr>
+          <w:p>
+            <w:pPr>
+              <w:spacing w:after="20" w:before="20" w:line="269" w:lineRule="auto"/>
+              <w:jc w:val="center"/>
+            </w:pPr>
+            <w:r>
+              <w:rPr>
+                <w:b w:val="0"/>
+                <w:sz w:val="20"/>
+              </w:rPr>
+              <w:t>渗透与界面状态</w:t>
+            </w:r>
+          </w:p>
+        </w:tc>
+        <w:tc>
+          <w:tcPr>
+            <w:tcW w:type="dxa" w:w="2583"/>
+            <w:vAlign w:val="center"/>
+            <w:tcMar>
+              <w:top w:w="75" w:type="dxa"/>
+              <w:left w:w="75" w:type="dxa"/>
+              <w:bottom w:w="75" w:type="dxa"/>
+              <w:right w:w="75" w:type="dxa"/>
+            </w:tcMar>
+            <w:shd w:fill="FFFFFF"/>
+          </w:tcPr>
+          <w:p>
+            <w:pPr>
+              <w:spacing w:after="20" w:before="20" w:line="269" w:lineRule="auto"/>
+            </w:pPr>
+            <w:r>
+              <w:rPr>
+                <w:b w:val="0"/>
+                <w:sz w:val="20"/>
+              </w:rPr>
+              <w:t>低水头渗透或等效试验；界面取样/剪切记录</w:t>
+            </w:r>
+          </w:p>
+        </w:tc>
+        <w:tc>
+          <w:tcPr>
+            <w:tcW w:type="dxa" w:w="2186"/>
+            <w:vAlign w:val="center"/>
+            <w:tcMar>
+              <w:top w:w="75" w:type="dxa"/>
+              <w:left w:w="75" w:type="dxa"/>
+              <w:bottom w:w="75" w:type="dxa"/>
+              <w:right w:w="75" w:type="dxa"/>
+            </w:tcMar>
+            <w:shd w:fill="FFFFFF"/>
+          </w:tcPr>
+          <w:p>
+            <w:pPr>
+              <w:spacing w:after="20" w:before="20" w:line="269" w:lineRule="auto"/>
+            </w:pPr>
+            <w:r>
+              <w:rPr>
+                <w:b w:val="0"/>
+                <w:sz w:val="20"/>
+              </w:rPr>
+              <w:t>正式配方的渗透系数和界面剪切指标应落在先导中位数±20%范围；先导不足时只记录不放行</w:t>
+            </w:r>
+          </w:p>
+        </w:tc>
+        <w:tc>
+          <w:tcPr>
+            <w:tcW w:type="dxa" w:w="3378"/>
+            <w:vAlign w:val="center"/>
+            <w:tcMar>
+              <w:top w:w="75" w:type="dxa"/>
+              <w:left w:w="75" w:type="dxa"/>
+              <w:bottom w:w="75" w:type="dxa"/>
+              <w:right w:w="75" w:type="dxa"/>
+            </w:tcMar>
+            <w:shd w:fill="FFFFFF"/>
+          </w:tcPr>
+          <w:p>
+            <w:pPr>
+              <w:spacing w:after="20" w:before="20" w:line="269" w:lineRule="auto"/>
+            </w:pPr>
+            <w:r>
+              <w:rPr>
+                <w:b w:val="0"/>
+                <w:sz w:val="20"/>
+              </w:rPr>
+              <w:t>先补做材料小试，不能凭加水量推断渗透性</w:t>
+            </w:r>
+          </w:p>
+        </w:tc>
+      </w:tr>
+      <w:tr>
+        <w:trPr>
+          <w:cantSplit/>
+        </w:trPr>
+        <w:tc>
+          <w:tcPr>
+            <w:tcW w:type="dxa" w:w="1788"/>
+            <w:vAlign w:val="center"/>
+            <w:tcMar>
+              <w:top w:w="75" w:type="dxa"/>
+              <w:left w:w="75" w:type="dxa"/>
+              <w:bottom w:w="75" w:type="dxa"/>
+              <w:right w:w="75" w:type="dxa"/>
+            </w:tcMar>
+            <w:shd w:fill="F5F7F8"/>
+          </w:tcPr>
+          <w:p>
+            <w:pPr>
+              <w:spacing w:after="20" w:before="20" w:line="269" w:lineRule="auto"/>
+              <w:jc w:val="center"/>
+            </w:pPr>
+            <w:r>
+              <w:rPr>
+                <w:b w:val="0"/>
+                <w:sz w:val="20"/>
+              </w:rPr>
+              <w:t>支架、侧壁与承托</w:t>
+            </w:r>
+          </w:p>
+        </w:tc>
+        <w:tc>
+          <w:tcPr>
+            <w:tcW w:type="dxa" w:w="2583"/>
+            <w:vAlign w:val="center"/>
+            <w:tcMar>
+              <w:top w:w="75" w:type="dxa"/>
+              <w:left w:w="75" w:type="dxa"/>
+              <w:bottom w:w="75" w:type="dxa"/>
+              <w:right w:w="75" w:type="dxa"/>
+            </w:tcMar>
+            <w:shd w:fill="F5F7F8"/>
+          </w:tcPr>
+          <w:p>
+            <w:pPr>
+              <w:spacing w:after="20" w:before="20" w:line="269" w:lineRule="auto"/>
+            </w:pPr>
+            <w:r>
+              <w:rPr>
+                <w:b w:val="0"/>
+                <w:sz w:val="20"/>
+              </w:rPr>
+              <w:t>加载前检查、连接扭矩记录、空载和模拟湿土载荷试验</w:t>
+            </w:r>
+          </w:p>
+        </w:tc>
+        <w:tc>
+          <w:tcPr>
+            <w:tcW w:type="dxa" w:w="2186"/>
+            <w:vAlign w:val="center"/>
+            <w:tcMar>
+              <w:top w:w="75" w:type="dxa"/>
+              <w:left w:w="75" w:type="dxa"/>
+              <w:bottom w:w="75" w:type="dxa"/>
+              <w:right w:w="75" w:type="dxa"/>
+            </w:tcMar>
+            <w:shd w:fill="F5F7F8"/>
+          </w:tcPr>
+          <w:p>
+            <w:pPr>
+              <w:spacing w:after="20" w:before="20" w:line="269" w:lineRule="auto"/>
+            </w:pPr>
+            <w:r>
+              <w:rPr>
+                <w:b w:val="0"/>
+                <w:sz w:val="20"/>
+              </w:rPr>
+              <w:t>由加工方完成强度/刚度验算；实测变形、侧壁间隙和漏水处置均有签字记录</w:t>
+            </w:r>
+          </w:p>
+        </w:tc>
+        <w:tc>
+          <w:tcPr>
+            <w:tcW w:type="dxa" w:w="3378"/>
+            <w:vAlign w:val="center"/>
+            <w:tcMar>
+              <w:top w:w="75" w:type="dxa"/>
+              <w:left w:w="75" w:type="dxa"/>
+              <w:bottom w:w="75" w:type="dxa"/>
+              <w:right w:w="75" w:type="dxa"/>
+            </w:tcMar>
+            <w:shd w:fill="F5F7F8"/>
+          </w:tcPr>
+          <w:p>
+            <w:pPr>
+              <w:spacing w:after="20" w:before="20" w:line="269" w:lineRule="auto"/>
+            </w:pPr>
+            <w:r>
+              <w:rPr>
+                <w:b w:val="0"/>
+                <w:sz w:val="20"/>
+              </w:rPr>
+              <w:t>未完成验算或出现永久变形时禁止铺土和加水</w:t>
+            </w:r>
+          </w:p>
+        </w:tc>
+      </w:tr>
+      <w:tr>
+        <w:trPr>
+          <w:cantSplit/>
+        </w:trPr>
+        <w:tc>
+          <w:tcPr>
+            <w:tcW w:type="dxa" w:w="1788"/>
+            <w:vAlign w:val="center"/>
+            <w:tcMar>
+              <w:top w:w="75" w:type="dxa"/>
+              <w:left w:w="75" w:type="dxa"/>
+              <w:bottom w:w="75" w:type="dxa"/>
+              <w:right w:w="75" w:type="dxa"/>
+            </w:tcMar>
+            <w:shd w:fill="FFFFFF"/>
+          </w:tcPr>
+          <w:p>
+            <w:pPr>
+              <w:spacing w:after="20" w:before="20" w:line="269" w:lineRule="auto"/>
+              <w:jc w:val="center"/>
+            </w:pPr>
+            <w:r>
+              <w:rPr>
+                <w:b w:val="0"/>
+                <w:sz w:val="20"/>
+              </w:rPr>
+              <w:t>排水与密封</w:t>
+            </w:r>
+          </w:p>
+        </w:tc>
+        <w:tc>
+          <w:tcPr>
+            <w:tcW w:type="dxa" w:w="2583"/>
+            <w:vAlign w:val="center"/>
+            <w:tcMar>
+              <w:top w:w="75" w:type="dxa"/>
+              <w:left w:w="75" w:type="dxa"/>
+              <w:bottom w:w="75" w:type="dxa"/>
+              <w:right w:w="75" w:type="dxa"/>
+            </w:tcMar>
+            <w:shd w:fill="FFFFFF"/>
+          </w:tcPr>
+          <w:p>
+            <w:pPr>
+              <w:spacing w:after="20" w:before="20" w:line="269" w:lineRule="auto"/>
+            </w:pPr>
+            <w:r>
+              <w:rPr>
+                <w:b w:val="0"/>
+                <w:sz w:val="20"/>
+              </w:rPr>
+              <w:t>分段注水检漏、坡脚收集量和溢流路径照片</w:t>
+            </w:r>
+          </w:p>
+        </w:tc>
+        <w:tc>
+          <w:tcPr>
+            <w:tcW w:type="dxa" w:w="2186"/>
+            <w:vAlign w:val="center"/>
+            <w:tcMar>
+              <w:top w:w="75" w:type="dxa"/>
+              <w:left w:w="75" w:type="dxa"/>
+              <w:bottom w:w="75" w:type="dxa"/>
+              <w:right w:w="75" w:type="dxa"/>
+            </w:tcMar>
+            <w:shd w:fill="FFFFFF"/>
+          </w:tcPr>
+          <w:p>
+            <w:pPr>
+              <w:spacing w:after="20" w:before="20" w:line="269" w:lineRule="auto"/>
+            </w:pPr>
+            <w:r>
+              <w:rPr>
+                <w:b w:val="0"/>
+                <w:sz w:val="20"/>
+              </w:rPr>
+              <w:t>30 min检漏无不可接受外漏；排水量可单独称量；裸槽接雨与土体径流分开</w:t>
+            </w:r>
+          </w:p>
+        </w:tc>
+        <w:tc>
+          <w:tcPr>
+            <w:tcW w:type="dxa" w:w="3378"/>
+            <w:vAlign w:val="center"/>
+            <w:tcMar>
+              <w:top w:w="75" w:type="dxa"/>
+              <w:left w:w="75" w:type="dxa"/>
+              <w:bottom w:w="75" w:type="dxa"/>
+              <w:right w:w="75" w:type="dxa"/>
+            </w:tcMar>
+            <w:shd w:fill="FFFFFF"/>
+          </w:tcPr>
+          <w:p>
+            <w:pPr>
+              <w:spacing w:after="20" w:before="20" w:line="269" w:lineRule="auto"/>
+            </w:pPr>
+            <w:r>
+              <w:rPr>
+                <w:b w:val="0"/>
+                <w:sz w:val="20"/>
+              </w:rPr>
+              <w:t>外漏、堵塞或量程不足时返工水路后重做检漏</w:t>
+            </w:r>
+          </w:p>
+        </w:tc>
+      </w:tr>
+      <w:tr>
+        <w:trPr>
+          <w:cantSplit/>
+        </w:trPr>
+        <w:tc>
+          <w:tcPr>
+            <w:tcW w:type="dxa" w:w="1788"/>
+            <w:vAlign w:val="center"/>
+            <w:tcMar>
+              <w:top w:w="75" w:type="dxa"/>
+              <w:left w:w="75" w:type="dxa"/>
+              <w:bottom w:w="75" w:type="dxa"/>
+              <w:right w:w="75" w:type="dxa"/>
+            </w:tcMar>
+            <w:shd w:fill="F5F7F8"/>
+          </w:tcPr>
+          <w:p>
+            <w:pPr>
+              <w:spacing w:after="20" w:before="20" w:line="269" w:lineRule="auto"/>
+              <w:jc w:val="center"/>
+            </w:pPr>
+            <w:r>
+              <w:rPr>
+                <w:b w:val="0"/>
+                <w:sz w:val="20"/>
+              </w:rPr>
+              <w:t>光纤制造与传力</w:t>
+            </w:r>
+          </w:p>
+        </w:tc>
+        <w:tc>
+          <w:tcPr>
+            <w:tcW w:type="dxa" w:w="2583"/>
+            <w:vAlign w:val="center"/>
+            <w:tcMar>
+              <w:top w:w="75" w:type="dxa"/>
+              <w:left w:w="75" w:type="dxa"/>
+              <w:bottom w:w="75" w:type="dxa"/>
+              <w:right w:w="75" w:type="dxa"/>
+            </w:tcMar>
+            <w:shd w:fill="F5F7F8"/>
+          </w:tcPr>
+          <w:p>
+            <w:pPr>
+              <w:spacing w:after="20" w:before="20" w:line="269" w:lineRule="auto"/>
+            </w:pPr>
+            <w:r>
+              <w:rPr>
+                <w:b w:val="0"/>
+                <w:sz w:val="20"/>
+              </w:rPr>
+              <w:t>成品外观、静态弯曲半径、拉脱/护套检查、标定曲线</w:t>
+            </w:r>
+          </w:p>
+        </w:tc>
+        <w:tc>
+          <w:tcPr>
+            <w:tcW w:type="dxa" w:w="2186"/>
+            <w:vAlign w:val="center"/>
+            <w:tcMar>
+              <w:top w:w="75" w:type="dxa"/>
+              <w:left w:w="75" w:type="dxa"/>
+              <w:bottom w:w="75" w:type="dxa"/>
+              <w:right w:w="75" w:type="dxa"/>
+            </w:tcMar>
+            <w:shd w:fill="F5F7F8"/>
+          </w:tcPr>
+          <w:p>
+            <w:pPr>
+              <w:spacing w:after="20" w:before="20" w:line="269" w:lineRule="auto"/>
+            </w:pPr>
+            <w:r>
+              <w:rPr>
+                <w:b w:val="0"/>
+                <w:sz w:val="20"/>
+              </w:rPr>
+              <w:t>批内样件静态误差≤全量程跨度10%、迟滞≤5%、标定斜率CV≤10%；湿态复测有效</w:t>
+            </w:r>
+          </w:p>
+        </w:tc>
+        <w:tc>
+          <w:tcPr>
+            <w:tcW w:type="dxa" w:w="3378"/>
+            <w:vAlign w:val="center"/>
+            <w:tcMar>
+              <w:top w:w="75" w:type="dxa"/>
+              <w:left w:w="75" w:type="dxa"/>
+              <w:bottom w:w="75" w:type="dxa"/>
+              <w:right w:w="75" w:type="dxa"/>
+            </w:tcMar>
+            <w:shd w:fill="F5F7F8"/>
+          </w:tcPr>
+          <w:p>
+            <w:pPr>
+              <w:spacing w:after="20" w:before="20" w:line="269" w:lineRule="auto"/>
+            </w:pPr>
+            <w:r>
+              <w:rPr>
+                <w:b w:val="0"/>
+                <w:sz w:val="20"/>
+              </w:rPr>
+              <w:t>这些是项目目标而非统一光纤标准；未通过时更换封装或重新标定</w:t>
+            </w:r>
+          </w:p>
+        </w:tc>
+      </w:tr>
+      <w:tr>
+        <w:trPr>
+          <w:cantSplit/>
+        </w:trPr>
+        <w:tc>
+          <w:tcPr>
+            <w:tcW w:type="dxa" w:w="1788"/>
+            <w:vAlign w:val="center"/>
+            <w:tcMar>
+              <w:top w:w="75" w:type="dxa"/>
+              <w:left w:w="75" w:type="dxa"/>
+              <w:bottom w:w="75" w:type="dxa"/>
+              <w:right w:w="75" w:type="dxa"/>
+            </w:tcMar>
+            <w:shd w:fill="FFFFFF"/>
+          </w:tcPr>
+          <w:p>
+            <w:pPr>
+              <w:spacing w:after="20" w:before="20" w:line="269" w:lineRule="auto"/>
+              <w:jc w:val="center"/>
+            </w:pPr>
+            <w:r>
+              <w:rPr>
+                <w:b w:val="0"/>
+                <w:sz w:val="20"/>
+              </w:rPr>
+              <w:t>记录可追溯性</w:t>
+            </w:r>
+          </w:p>
+        </w:tc>
+        <w:tc>
+          <w:tcPr>
+            <w:tcW w:type="dxa" w:w="2583"/>
+            <w:vAlign w:val="center"/>
+            <w:tcMar>
+              <w:top w:w="75" w:type="dxa"/>
+              <w:left w:w="75" w:type="dxa"/>
+              <w:bottom w:w="75" w:type="dxa"/>
+              <w:right w:w="75" w:type="dxa"/>
+            </w:tcMar>
+            <w:shd w:fill="FFFFFF"/>
+          </w:tcPr>
+          <w:p>
+            <w:pPr>
+              <w:spacing w:after="20" w:before="20" w:line="269" w:lineRule="auto"/>
+            </w:pPr>
+            <w:r>
+              <w:rPr>
+                <w:b w:val="0"/>
+                <w:sz w:val="20"/>
+              </w:rPr>
+              <w:t>制造卡、照片、称量、标定文件与哈希核对</w:t>
+            </w:r>
+          </w:p>
+        </w:tc>
+        <w:tc>
+          <w:tcPr>
+            <w:tcW w:type="dxa" w:w="2186"/>
+            <w:vAlign w:val="center"/>
+            <w:tcMar>
+              <w:top w:w="75" w:type="dxa"/>
+              <w:left w:w="75" w:type="dxa"/>
+              <w:bottom w:w="75" w:type="dxa"/>
+              <w:right w:w="75" w:type="dxa"/>
+            </w:tcMar>
+            <w:shd w:fill="FFFFFF"/>
+          </w:tcPr>
+          <w:p>
+            <w:pPr>
+              <w:spacing w:after="20" w:before="20" w:line="269" w:lineRule="auto"/>
+            </w:pPr>
+            <w:r>
+              <w:rPr>
+                <w:b w:val="0"/>
+                <w:sz w:val="20"/>
+              </w:rPr>
+              <w:t>每层、每点、每个批次都有唯一ID；原始文件至少双份保存</w:t>
+            </w:r>
+          </w:p>
+        </w:tc>
+        <w:tc>
+          <w:tcPr>
+            <w:tcW w:type="dxa" w:w="3378"/>
+            <w:vAlign w:val="center"/>
+            <w:tcMar>
+              <w:top w:w="75" w:type="dxa"/>
+              <w:left w:w="75" w:type="dxa"/>
+              <w:bottom w:w="75" w:type="dxa"/>
+              <w:right w:w="75" w:type="dxa"/>
+            </w:tcMar>
+            <w:shd w:fill="FFFFFF"/>
+          </w:tcPr>
+          <w:p>
+            <w:pPr>
+              <w:spacing w:after="20" w:before="20" w:line="269" w:lineRule="auto"/>
+            </w:pPr>
+            <w:r>
+              <w:rPr>
+                <w:b w:val="0"/>
+                <w:sz w:val="20"/>
+              </w:rPr>
+              <w:t>缺记录的构件不进入正式重建，补测也要标明补测时间</w:t>
+            </w:r>
+          </w:p>
+        </w:tc>
+      </w:tr>
+    </w:tbl>
+    <w:p>
+      <w:pPr>
+        <w:spacing w:after="40"/>
+      </w:pPr>
+    </w:p>
+    <w:p>
+      <w:pPr>
+        <w:pStyle w:val="Heading2"/>
+      </w:pPr>
+      <w:r>
+        <w:t>17.1 评价结果的表达规则</w:t>
+      </w:r>
+    </w:p>
+    <w:p>
+      <w:r>
+        <w:t>每个批次报告“实测值、测量不确定度、目标值、偏差、是否放行、偏差处置”六项，不只写“合格”。涉及材料的数值必须注明干基或湿基、取样位置和时间；涉及光纤的数值必须注明解调器、采样率、温度状态、标距和calibration_id。若使用GB/T 50123或GB 50330，应写明现行版本和实际采用的试验/监测项目，不得只写标准编号。</w:t>
+      </w:r>
+    </w:p>
+    <w:p>
+      <w:r>
+        <w:t>本手册中的32°、±2 mm、±0.5个百分点、±2%和±20%是用于启动制造的项目建议，不是论文给出的通用阈值。正式报告同时给出首轮小试的均值、标准差和样本数；若建议线不适合材料或设备，应在正式试验前修订版本号，不能事后为迁就结果修改门槛。</w:t>
       </w:r>
     </w:p>
     <w:sectPr>

</xml_diff>